<commit_message>
Added some stuff. Tweaked spawning values.
</commit_message>
<xml_diff>
--- a/Resources/FIT1045_1053 H2 Learning Journal.docx
+++ b/Resources/FIT1045_1053 H2 Learning Journal.docx
@@ -2317,154 +2317,82 @@
     </w:p>
     <w:p>
       <w:pPr>
-        <w:pStyle w:val="ListParagraph"/>
-        <w:numPr>
-          <w:ilvl w:val="0"/>
-          <w:numId w:val="5"/>
-        </w:numPr>
-        <w:rPr>
-          <w:lang w:val="en-MY"/>
-        </w:rPr>
-      </w:pPr>
-      <w:r>
-        <w:rPr>
-          <w:lang w:val="en-MY"/>
-        </w:rPr>
-        <w:t>Adventures in mapping</w:t>
-      </w:r>
-    </w:p>
-    <w:p>
-      <w:pPr>
-        <w:pStyle w:val="ListParagraph"/>
-        <w:numPr>
-          <w:ilvl w:val="0"/>
-          <w:numId w:val="5"/>
-        </w:numPr>
-        <w:rPr>
-          <w:lang w:val="en-MY"/>
-        </w:rPr>
-      </w:pPr>
-      <w:r>
-        <w:rPr>
-          <w:lang w:val="en-MY"/>
-        </w:rPr>
-        <w:t>Positioning issues</w:t>
-      </w:r>
-    </w:p>
-    <w:p>
-      <w:pPr>
-        <w:pStyle w:val="ListParagraph"/>
-        <w:numPr>
-          <w:ilvl w:val="0"/>
-          <w:numId w:val="5"/>
-        </w:numPr>
-        <w:rPr>
-          <w:lang w:val="en-MY"/>
-        </w:rPr>
-      </w:pPr>
-      <w:r>
-        <w:rPr>
-          <w:lang w:val="en-MY"/>
-        </w:rPr>
-        <w:t>Premeasurement like jetpack compose to position properly</w:t>
-      </w:r>
-    </w:p>
-    <w:p>
-      <w:pPr>
-        <w:pStyle w:val="ListParagraph"/>
-        <w:numPr>
-          <w:ilvl w:val="0"/>
-          <w:numId w:val="5"/>
-        </w:numPr>
-        <w:rPr>
-          <w:lang w:val="en-MY"/>
-        </w:rPr>
-      </w:pPr>
-      <w:r>
-        <w:rPr>
-          <w:lang w:val="en-MY"/>
-        </w:rPr>
-        <w:t>Should have iterated</w:t>
-      </w:r>
-    </w:p>
-    <w:p>
-      <w:pPr>
-        <w:pStyle w:val="ListParagraph"/>
-        <w:numPr>
-          <w:ilvl w:val="0"/>
-          <w:numId w:val="5"/>
-        </w:numPr>
-        <w:rPr>
-          <w:lang w:val="en-MY"/>
-        </w:rPr>
-      </w:pPr>
-      <w:r>
-        <w:rPr>
-          <w:lang w:val="en-MY"/>
-        </w:rPr>
-        <w:t>Forgot to take screenshots of previous algorithms</w:t>
-      </w:r>
-    </w:p>
-    <w:p>
-      <w:pPr>
-        <w:pStyle w:val="ListParagraph"/>
-        <w:numPr>
-          <w:ilvl w:val="0"/>
-          <w:numId w:val="5"/>
-        </w:numPr>
-        <w:rPr>
-          <w:lang w:val="en-MY"/>
-        </w:rPr>
-      </w:pPr>
-      <w:r>
-        <w:rPr>
-          <w:lang w:val="en-MY"/>
-        </w:rPr>
-        <w:t>Parallax solved!</w:t>
-      </w:r>
-    </w:p>
-    <w:p>
-      <w:pPr>
-        <w:pStyle w:val="ListParagraph"/>
-        <w:numPr>
-          <w:ilvl w:val="0"/>
-          <w:numId w:val="5"/>
-        </w:numPr>
-        <w:rPr>
-          <w:lang w:val="en-MY"/>
-        </w:rPr>
-      </w:pPr>
-      <w:r>
-        <w:rPr>
-          <w:lang w:val="en-MY"/>
-        </w:rPr>
-        <w:t>Paradigm change (generate and link at different stages instead of together)</w:t>
-      </w:r>
-    </w:p>
-    <w:p>
-      <w:pPr>
-        <w:pStyle w:val="ListParagraph"/>
-        <w:numPr>
-          <w:ilvl w:val="0"/>
-          <w:numId w:val="5"/>
-        </w:numPr>
-        <w:rPr>
-          <w:lang w:val="en-MY"/>
-        </w:rPr>
-      </w:pPr>
-      <w:r>
-        <w:rPr>
-          <w:lang w:val="en-MY"/>
-        </w:rPr>
-        <w:t>It works!</w:t>
-      </w:r>
-    </w:p>
-    <w:p>
-      <w:pPr>
-        <w:rPr>
-          <w:lang w:val="en-MY"/>
-        </w:rPr>
-      </w:pPr>
+        <w:rPr>
+          <w:lang w:val="en-MY"/>
+        </w:rPr>
+      </w:pPr>
+    </w:p>
+    <w:p>
+      <w:pPr>
+        <w:rPr>
+          <w:lang w:val="en-MY"/>
+        </w:rPr>
+      </w:pPr>
+      <w:r>
+        <w:rPr>
+          <w:lang w:val="en-MY"/>
+        </w:rPr>
+        <w:t>That was an adventure. At first I bumbled about the algorithm, and, as somewhat expected, it didn’t work. Not only was there the parallax effect, the rooms themselves were scattered across and beyond the screen, and joined in unexpected paths. The view idea also didn’t work. Since the map would be larger than the screen, my idea was to draw them to a separate bitmap, then display the portion of that that would fit on the screen, automatically handling cutoffs at sprite boundaries. However, I couldn’t get the math to work right. This was the first aspect to be scrapped. Instead, the whole map is rendered regardless of overlaps with existing objects. The next problem I considered was positioning. I realised the positioning algorithm was flawed since it didn’t consider that two nodes may connect to the same one. This was a difficult problem, since the map needed to be positioned based on its widest point, information that would not be available until the end of the map generation. I considered solving this by setting position later based on a recursive measurement of child nodes, like Jetpack Compose.</w:t>
+      </w:r>
+    </w:p>
+    <w:p>
+      <w:pPr>
+        <w:rPr>
+          <w:lang w:val="en-MY"/>
+        </w:rPr>
+      </w:pPr>
+    </w:p>
+    <w:p>
+      <w:pPr>
+        <w:rPr>
+          <w:lang w:val="en-MY"/>
+        </w:rPr>
+      </w:pPr>
+      <w:r>
+        <w:rPr>
+          <w:lang w:val="en-MY"/>
+        </w:rPr>
+        <w:lastRenderedPageBreak/>
+        <w:t>In the end I did not need to do this.</w:t>
+      </w:r>
+      <w:r>
+        <w:rPr>
+          <w:lang w:val="en-MY"/>
+        </w:rPr>
+        <w:t xml:space="preserve"> After thinking about other possible solutions for a few hours I imagined a new algorithm.</w:t>
+      </w:r>
+      <w:r>
+        <w:rPr>
+          <w:lang w:val="en-MY"/>
+        </w:rPr>
+        <w:t xml:space="preserve"> Instead of generating rooms and connections at the same time, what if the rooms in each layer were set first, then they were connected in a second pass. That way, all necessary information is already known with no need for excessively convoluted constructions like my proposed fixes to my first algorithm. It always brings me such joy when a problem is resolved elegantly. It wasn’t perfect, of course. Since making connections was random, there would be quite a few dangling rooms. I fixed this by adding a second pass in reverse order, connecting unconnected-to rooms to rooms behind them. Curses, it now occurs to me that I didn’t take any screenshots.</w:t>
+      </w:r>
+    </w:p>
+    <w:p>
+      <w:pPr>
+        <w:rPr>
+          <w:lang w:val="en-MY"/>
+        </w:rPr>
+      </w:pPr>
+    </w:p>
+    <w:p>
+      <w:pPr>
+        <w:rPr>
+          <w:lang w:val="en-MY"/>
+        </w:rPr>
+      </w:pPr>
+      <w:r>
+        <w:rPr>
+          <w:lang w:val="en-MY"/>
+        </w:rPr>
+        <w:t>I also found the cause of the strange parallax effect. The map was originally a linked list of rooms, with most calls like move and render calls propagating along from the first room. However, if multiple rooms connected to a single one its methods would be called twice.</w:t>
+      </w:r>
+      <w:r>
+        <w:rPr>
+          <w:lang w:val="en-MY"/>
+        </w:rPr>
+        <w:t xml:space="preserve"> To fix this I changed the structure to a simple list of rooms that is iterated over. No need for unnecessary complexity.</w:t>
+      </w:r>
     </w:p>
     <w:p>
       <w:pPr>
@@ -2496,32 +2424,274 @@
         <w:rPr>
           <w:lang w:val="en-MY"/>
         </w:rPr>
-        <w:t xml:space="preserve"> Made and implemented a few room types, and NPC’s. The base NPC class shares a lot of basic code with the entity but </w:t>
+        <w:t xml:space="preserve"> Made and implemented a few room types, and NPC’s. The base NPC class shares a lot of basic code with the entity but when I tried to refactor them together some bitmaps started not rendering. In the past this error is because a drawing_options was initialised before the window, but I’ve no idea how moving the code in the way that I did would cause that, nor do I have enough time to track it down, so they’ll be separate for now.</w:t>
+      </w:r>
+      <w:r>
+        <w:rPr>
+          <w:lang w:val="en-MY"/>
+        </w:rPr>
+        <w:t xml:space="preserve"> Finished chests and merchants.</w:t>
+      </w:r>
+      <w:r>
+        <w:rPr>
+          <w:lang w:val="en-MY"/>
+        </w:rPr>
+        <w:t xml:space="preserve"> I still don’t know about the value system though.</w:t>
+      </w:r>
+      <w:r>
+        <w:rPr>
+          <w:lang w:val="en-MY"/>
+        </w:rPr>
+        <w:t xml:space="preserve"> Also polished the map generation algorithm a little to get rid of dangling rooms.</w:t>
+      </w:r>
+    </w:p>
+    <w:p>
+      <w:pPr>
+        <w:rPr>
+          <w:lang w:val="en-MY"/>
+        </w:rPr>
+      </w:pPr>
+    </w:p>
+    <w:p>
+      <w:pPr>
+        <w:pStyle w:val="Heading1"/>
+        <w:rPr>
+          <w:lang w:val="en-MY"/>
+        </w:rPr>
+      </w:pPr>
+      <w:r>
+        <w:rPr>
+          <w:lang w:val="en-MY"/>
+        </w:rPr>
+        <w:t>1 June</w:t>
+      </w:r>
+    </w:p>
+    <w:p>
+      <w:pPr>
+        <w:rPr>
+          <w:lang w:val="en-MY"/>
+        </w:rPr>
+      </w:pPr>
+      <w:r>
+        <w:rPr>
+          <w:lang w:val="en-MY"/>
+        </w:rPr>
+        <w:t>Thought of an algorithm for generating balanced enem</w:t>
+      </w:r>
+      <w:r>
+        <w:rPr>
+          <w:lang w:val="en-MY"/>
+        </w:rPr>
+        <w:t>ies for rooms and items for the merchant.</w:t>
+      </w:r>
+      <w:r>
+        <w:rPr>
+          <w:lang w:val="en-MY"/>
+        </w:rPr>
+        <w:t xml:space="preserve"> I’ll implement it if I can, have to work on the save system first.</w:t>
+      </w:r>
+      <w:r>
+        <w:rPr>
+          <w:lang w:val="en-MY"/>
+        </w:rPr>
+        <w:t xml:space="preserve"> The idea is this: imagine a graph with value (of the enemy/item) on the x-axis and the probability it is chosen on the y-axis. The x-axis is split into several buckets of equal size. A normal distribution </w:t>
+      </w:r>
+      <w:r>
+        <w:rPr>
+          <w:lang w:val="en-MY"/>
+        </w:rPr>
+        <w:t>will</w:t>
+      </w:r>
+      <w:r>
+        <w:rPr>
+          <w:lang w:val="en-MY"/>
+        </w:rPr>
+        <w:t xml:space="preserve"> represent the probability of a bucket being chosen</w:t>
+      </w:r>
+      <w:r>
+        <w:rPr>
+          <w:lang w:val="en-MY"/>
+        </w:rPr>
+        <w:t xml:space="preserve"> (each bucket being evaluated at its right edge)</w:t>
+      </w:r>
+      <w:r>
+        <w:rPr>
+          <w:lang w:val="en-MY"/>
+        </w:rPr>
+        <w:t>. The mean of the distribution can be altered</w:t>
+      </w:r>
+      <w:r>
+        <w:rPr>
+          <w:lang w:val="en-MY"/>
+        </w:rPr>
+        <w:t xml:space="preserve"> to change the average value of a chosen bucket. The standard deviation remains constant and represents how far outside the expected value can still be chosen.</w:t>
+      </w:r>
+      <w:r>
+        <w:rPr>
+          <w:lang w:val="en-MY"/>
+        </w:rPr>
+        <w:t xml:space="preserve"> The probability represented by the tails beyond the first and last bucket are added to the first and last bucket to ensure a bucket is always chosen.</w:t>
+      </w:r>
+    </w:p>
+    <w:p>
+      <w:pPr>
+        <w:rPr>
+          <w:lang w:val="en-MY"/>
+        </w:rPr>
+      </w:pPr>
+    </w:p>
+    <w:p>
+      <w:pPr>
+        <w:rPr>
+          <w:lang w:val="en-MY"/>
+        </w:rPr>
+      </w:pPr>
+      <w:r>
+        <w:rPr>
+          <w:lang w:val="en-MY"/>
+        </w:rPr>
+        <w:t>Speaking of which, I’ve created my first memory leak</w:t>
+      </w:r>
+      <w:r>
+        <w:rPr>
+          <w:lang w:val="en-MY"/>
+        </w:rPr>
+        <w:t>, at the rate of around 30 Mbps</w:t>
+      </w:r>
+      <w:r>
+        <w:rPr>
+          <w:lang w:val="en-MY"/>
+        </w:rPr>
+        <w:t>.</w:t>
+      </w:r>
+      <w:r>
+        <w:rPr>
+          <w:lang w:val="en-MY"/>
+        </w:rPr>
+        <w:t xml:space="preserve"> This is the cost of spamming pointers everywhere,</w:t>
+      </w:r>
+      <w:r>
+        <w:rPr>
+          <w:lang w:val="en-MY"/>
+        </w:rPr>
+        <w:t xml:space="preserve"> perhaps</w:t>
+      </w:r>
+      <w:r>
+        <w:rPr>
+          <w:lang w:val="en-MY"/>
+        </w:rPr>
+        <w:t>.</w:t>
+      </w:r>
+      <w:r>
+        <w:rPr>
+          <w:lang w:val="en-MY"/>
+        </w:rPr>
+        <w:t xml:space="preserve"> Its quite a lot to store every second, though, 30 megabytes. Since it happens on startup there’s definitely </w:t>
       </w:r>
       <w:r>
         <w:rPr>
           <w:lang w:val="en-MY"/>
         </w:rPr>
         <w:lastRenderedPageBreak/>
-        <w:t>when I tried to refactor them together some bitmaps started not rendering. In the past this error is because a drawing_options was initialised before the window, but I’ve no idea how moving the code in the way that I did would cause that, nor do I have enough time to track it down, so they’ll be separate for now.</w:t>
-      </w:r>
-      <w:r>
-        <w:rPr>
-          <w:lang w:val="en-MY"/>
-        </w:rPr>
-        <w:t xml:space="preserve"> Finished chests and merchants.</w:t>
-      </w:r>
-      <w:r>
-        <w:rPr>
-          <w:lang w:val="en-MY"/>
-        </w:rPr>
-        <w:t xml:space="preserve"> I still don’t know about the value system though.</w:t>
-      </w:r>
-      <w:r>
-        <w:rPr>
-          <w:lang w:val="en-MY"/>
-        </w:rPr>
-        <w:t xml:space="preserve"> Also polished the map generation algorithm a little to get rid of dangling rooms.</w:t>
+        <w:t>something wrong with the system to load things from save files.</w:t>
+      </w:r>
+      <w:r>
+        <w:rPr>
+          <w:lang w:val="en-MY"/>
+        </w:rPr>
+        <w:t xml:space="preserve"> Looking at the save file, it seems the map is not cleared properly between saves, inflating the file to</w:t>
+      </w:r>
+      <w:r>
+        <w:rPr>
+          <w:lang w:val="en-MY"/>
+        </w:rPr>
+        <w:t xml:space="preserve"> (when I found it)</w:t>
+      </w:r>
+      <w:r>
+        <w:rPr>
+          <w:lang w:val="en-MY"/>
+        </w:rPr>
+        <w:t xml:space="preserve"> 610 KB. It’s a start, but still doesn’t explain the leakage.</w:t>
+      </w:r>
+      <w:r>
+        <w:rPr>
+          <w:lang w:val="en-MY"/>
+        </w:rPr>
+        <w:t xml:space="preserve"> After poking around a bit with the Task Manager and save file on hand, it seems each map node is duplicated many times upon </w:t>
+      </w:r>
+      <w:r>
+        <w:rPr>
+          <w:lang w:val="en-MY"/>
+        </w:rPr>
+        <w:t>loading from JSON</w:t>
+      </w:r>
+      <w:r>
+        <w:rPr>
+          <w:lang w:val="en-MY"/>
+        </w:rPr>
+        <w:t>, but restored back to normal upon closing the game. In that case the memory leak may not be a true leak, but rather a massive allocation of objects due to the map loading being recursive in nature.</w:t>
+      </w:r>
+      <w:r>
+        <w:rPr>
+          <w:lang w:val="en-MY"/>
+        </w:rPr>
+        <w:t xml:space="preserve"> After more looking, it seems the problem is not with the save function but rather the load function, probably because of its recursion</w:t>
+      </w:r>
+      <w:r>
+        <w:rPr>
+          <w:lang w:val="en-MY"/>
+        </w:rPr>
+        <w:t xml:space="preserve"> for map nodes.</w:t>
+      </w:r>
+      <w:r>
+        <w:rPr>
+          <w:lang w:val="en-MY"/>
+        </w:rPr>
+        <w:t xml:space="preserve"> Ah, I see, multiple nodes can connect to the same one, but the function doesn’t know that and loads every node it encounters, regardless of whether its been loaded already.</w:t>
+      </w:r>
+      <w:r>
+        <w:rPr>
+          <w:lang w:val="en-MY"/>
+        </w:rPr>
+        <w:t xml:space="preserve"> Indeed, with the addition of a check to see if the node has already been loaded, the bug is fixed.</w:t>
+      </w:r>
+      <w:r>
+        <w:rPr>
+          <w:lang w:val="en-MY"/>
+        </w:rPr>
+        <w:t xml:space="preserve"> So it wasn’t really a leak.</w:t>
+      </w:r>
+    </w:p>
+    <w:p>
+      <w:pPr>
+        <w:rPr>
+          <w:lang w:val="en-MY"/>
+        </w:rPr>
+      </w:pPr>
+    </w:p>
+    <w:p>
+      <w:pPr>
+        <w:rPr>
+          <w:lang w:val="en-MY"/>
+        </w:rPr>
+      </w:pPr>
+      <w:r>
+        <w:rPr>
+          <w:lang w:val="en-MY"/>
+        </w:rPr>
+        <w:t>I realise I use structured binding declarations in a few places, registration functions are what comes to mind, but I don’t really know how they work. Like, I can guess they automatically unpack types that expose some interface, but does the final type have to be reference or auto like I use? Frankly, the official docs on it are downright abstruse.</w:t>
+      </w:r>
+      <w:r>
+        <w:rPr>
+          <w:lang w:val="en-MY"/>
+        </w:rPr>
+        <w:t xml:space="preserve"> So much jargon</w:t>
+      </w:r>
+      <w:r>
+        <w:rPr>
+          <w:lang w:val="en-MY"/>
+        </w:rPr>
+        <w:t>, especially.</w:t>
       </w:r>
     </w:p>
     <w:p>
@@ -2542,249 +2712,6 @@
         <w:rPr>
           <w:lang w:val="en-MY"/>
         </w:rPr>
-        <w:t>1 June</w:t>
-      </w:r>
-    </w:p>
-    <w:p>
-      <w:pPr>
-        <w:rPr>
-          <w:lang w:val="en-MY"/>
-        </w:rPr>
-      </w:pPr>
-      <w:r>
-        <w:rPr>
-          <w:lang w:val="en-MY"/>
-        </w:rPr>
-        <w:t>Thought of an algorithm for generating balanced enem</w:t>
-      </w:r>
-      <w:r>
-        <w:rPr>
-          <w:lang w:val="en-MY"/>
-        </w:rPr>
-        <w:t>ies for rooms and items for the merchant.</w:t>
-      </w:r>
-      <w:r>
-        <w:rPr>
-          <w:lang w:val="en-MY"/>
-        </w:rPr>
-        <w:t xml:space="preserve"> I’ll implement it if I can, have to work on the save system first.</w:t>
-      </w:r>
-      <w:r>
-        <w:rPr>
-          <w:lang w:val="en-MY"/>
-        </w:rPr>
-        <w:t xml:space="preserve"> The idea is this: imagine a graph with value (of the enemy/item) on the x-axis and the probability it is chosen on the y-axis. The x-axis is split into several buckets of equal size. A normal distribution </w:t>
-      </w:r>
-      <w:r>
-        <w:rPr>
-          <w:lang w:val="en-MY"/>
-        </w:rPr>
-        <w:t>will</w:t>
-      </w:r>
-      <w:r>
-        <w:rPr>
-          <w:lang w:val="en-MY"/>
-        </w:rPr>
-        <w:t xml:space="preserve"> represent the probability of a bucket being chosen</w:t>
-      </w:r>
-      <w:r>
-        <w:rPr>
-          <w:lang w:val="en-MY"/>
-        </w:rPr>
-        <w:t xml:space="preserve"> (each bucket being evaluated at its right edge)</w:t>
-      </w:r>
-      <w:r>
-        <w:rPr>
-          <w:lang w:val="en-MY"/>
-        </w:rPr>
-        <w:t>. The mean of the distribution can be altered</w:t>
-      </w:r>
-      <w:r>
-        <w:rPr>
-          <w:lang w:val="en-MY"/>
-        </w:rPr>
-        <w:t xml:space="preserve"> to change the average value of a chosen bucket. The standard deviation remains constant and represents how far outside the expected value can still be chosen.</w:t>
-      </w:r>
-      <w:r>
-        <w:rPr>
-          <w:lang w:val="en-MY"/>
-        </w:rPr>
-        <w:t xml:space="preserve"> The probability represented by the tails beyond the first and last bucket are added to the first and last bucket to ensure a bucket is always chosen.</w:t>
-      </w:r>
-    </w:p>
-    <w:p>
-      <w:pPr>
-        <w:rPr>
-          <w:lang w:val="en-MY"/>
-        </w:rPr>
-      </w:pPr>
-    </w:p>
-    <w:p>
-      <w:pPr>
-        <w:rPr>
-          <w:lang w:val="en-MY"/>
-        </w:rPr>
-      </w:pPr>
-      <w:r>
-        <w:rPr>
-          <w:lang w:val="en-MY"/>
-        </w:rPr>
-        <w:t>Speaking of which, I’ve created my first memory leak</w:t>
-      </w:r>
-      <w:r>
-        <w:rPr>
-          <w:lang w:val="en-MY"/>
-        </w:rPr>
-        <w:t>, at the rate of around 30 Mbps</w:t>
-      </w:r>
-      <w:r>
-        <w:rPr>
-          <w:lang w:val="en-MY"/>
-        </w:rPr>
-        <w:t>.</w:t>
-      </w:r>
-      <w:r>
-        <w:rPr>
-          <w:lang w:val="en-MY"/>
-        </w:rPr>
-        <w:t xml:space="preserve"> This is the cost of spamming pointers everywhere,</w:t>
-      </w:r>
-      <w:r>
-        <w:rPr>
-          <w:lang w:val="en-MY"/>
-        </w:rPr>
-        <w:t xml:space="preserve"> perhaps</w:t>
-      </w:r>
-      <w:r>
-        <w:rPr>
-          <w:lang w:val="en-MY"/>
-        </w:rPr>
-        <w:t>.</w:t>
-      </w:r>
-      <w:r>
-        <w:rPr>
-          <w:lang w:val="en-MY"/>
-        </w:rPr>
-        <w:t xml:space="preserve"> Its quite a lot to store every second, though, 30 megabytes. Since it happens on startup there’s definitely something wrong with the system to load things from save files.</w:t>
-      </w:r>
-      <w:r>
-        <w:rPr>
-          <w:lang w:val="en-MY"/>
-        </w:rPr>
-        <w:t xml:space="preserve"> Looking at the save file, it seems the map is not cleared properly between saves, inflating the file to</w:t>
-      </w:r>
-      <w:r>
-        <w:rPr>
-          <w:lang w:val="en-MY"/>
-        </w:rPr>
-        <w:t xml:space="preserve"> (when I found it)</w:t>
-      </w:r>
-      <w:r>
-        <w:rPr>
-          <w:lang w:val="en-MY"/>
-        </w:rPr>
-        <w:t xml:space="preserve"> 610 KB. It’s a start, but still doesn’t explain the leakage.</w:t>
-      </w:r>
-      <w:r>
-        <w:rPr>
-          <w:lang w:val="en-MY"/>
-        </w:rPr>
-        <w:t xml:space="preserve"> After poking around a bit with the Task Manager and save file on hand, it seems each map node is duplicated many times upon </w:t>
-      </w:r>
-      <w:r>
-        <w:rPr>
-          <w:lang w:val="en-MY"/>
-        </w:rPr>
-        <w:t>loading from JSON</w:t>
-      </w:r>
-      <w:r>
-        <w:rPr>
-          <w:lang w:val="en-MY"/>
-        </w:rPr>
-        <w:t>, but restored back to normal upon closing the game. In that case the memory leak may not be a true leak, but rather a massive allocation of objects due to the map loading being recursive in nature.</w:t>
-      </w:r>
-      <w:r>
-        <w:rPr>
-          <w:lang w:val="en-MY"/>
-        </w:rPr>
-        <w:t xml:space="preserve"> After more looking, it seems the problem is not with the save function but rather the load function, probably because of its recursion</w:t>
-      </w:r>
-      <w:r>
-        <w:rPr>
-          <w:lang w:val="en-MY"/>
-        </w:rPr>
-        <w:t xml:space="preserve"> for map nodes.</w:t>
-      </w:r>
-      <w:r>
-        <w:rPr>
-          <w:lang w:val="en-MY"/>
-        </w:rPr>
-        <w:t xml:space="preserve"> Ah, I see, multiple nodes can connect to the same one, but the function doesn’t know that and loads every node it encounters, regardless of whether its been loaded already.</w:t>
-      </w:r>
-      <w:r>
-        <w:rPr>
-          <w:lang w:val="en-MY"/>
-        </w:rPr>
-        <w:t xml:space="preserve"> Indeed, with the addition of a check to see if the node has already been loaded, the bug is fixed.</w:t>
-      </w:r>
-      <w:r>
-        <w:rPr>
-          <w:lang w:val="en-MY"/>
-        </w:rPr>
-        <w:t xml:space="preserve"> So it wasn’t really a leak.</w:t>
-      </w:r>
-    </w:p>
-    <w:p>
-      <w:pPr>
-        <w:rPr>
-          <w:lang w:val="en-MY"/>
-        </w:rPr>
-      </w:pPr>
-    </w:p>
-    <w:p>
-      <w:pPr>
-        <w:rPr>
-          <w:lang w:val="en-MY"/>
-        </w:rPr>
-      </w:pPr>
-      <w:r>
-        <w:rPr>
-          <w:lang w:val="en-MY"/>
-        </w:rPr>
-        <w:t>I realise I use structured binding declarations in a few places, registration functions are what comes to mind, but I don’t really know how they work. Like, I can guess they automatically unpack types that expose some interface, but does the final type have to be reference or auto like I use? Frankly, the official docs on it are downright abstruse.</w:t>
-      </w:r>
-      <w:r>
-        <w:rPr>
-          <w:lang w:val="en-MY"/>
-        </w:rPr>
-        <w:t xml:space="preserve"> So much jargon</w:t>
-      </w:r>
-      <w:r>
-        <w:rPr>
-          <w:lang w:val="en-MY"/>
-        </w:rPr>
-        <w:t>, especially.</w:t>
-      </w:r>
-    </w:p>
-    <w:p>
-      <w:pPr>
-        <w:rPr>
-          <w:lang w:val="en-MY"/>
-        </w:rPr>
-      </w:pPr>
-    </w:p>
-    <w:p>
-      <w:pPr>
-        <w:pStyle w:val="Heading1"/>
-        <w:rPr>
-          <w:lang w:val="en-MY"/>
-        </w:rPr>
-      </w:pPr>
-      <w:r>
-        <w:rPr>
-          <w:lang w:val="en-MY"/>
-        </w:rPr>
-        <w:lastRenderedPageBreak/>
         <w:t>3 June</w:t>
       </w:r>
     </w:p>
@@ -2798,7 +2725,7 @@
         <w:rPr>
           <w:lang w:val="en-MY"/>
         </w:rPr>
-        <w:t>I can’t finish it in time.</w:t>
+        <w:t>Just adding content now.</w:t>
       </w:r>
     </w:p>
     <w:sectPr>

</xml_diff>